<commit_message>
Colossians audit: 8 gates pass, 39 text fixes (EN 33/KO 6), docs reuploaded
</commit_message>
<xml_diff>
--- a/gdocs_build/Colossians.docx
+++ b/gdocs_build/Colossians.docx
@@ -258,7 +258,7 @@
               <w:rPr>
                 <w:sz w:val="18"/>
               </w:rPr>
-              <w:t>We're always hitting up God, our Father, and Jesus, the Messiah, to say thanks for you guys. Seriously, we can't stop. We keep hearing about your solid faith in Christ, our Jesus, and how you're always showing love to all the other Christians. You guys are totally focused on your future in heaven, and that hope keeps you going strong.</w:t>
+              <w:t>We're always hitting up God, our Father, and Jesus, the Messiah, to say thanks for you guys. Seriously, we can't stop. We keep hearing about your solid faith in Christ, our Jesus, and how you're always showing love to all the other Christians. The line of purpose in your lives never goes slack — it's tied tight to your future in heaven, kept taut by hope.</w:t>
             </w:r>
           </w:p>
         </w:tc>
@@ -329,7 +329,7 @@
               <w:rPr>
                 <w:sz w:val="18"/>
               </w:rPr>
-              <w:t>The message you heard is the real deal, just as legit as the first day you heard it. It's not some trend that fades away; it's blowing up all over the world, getting bigger and stronger, just like it is with you. From the moment you heard and got what God is doing, you've been hungry for more. And it's still going strong, just like when our boy Epaphras taught you. He's a super-reliable worker for Christ — I can always count on him. He's the one who told us how the Spirit has made love a huge part of your lives.</w:t>
+              <w:t>The message you heard is the real deal, just as legit as the first day you heard it. It's not some trend that fades away; it's the same all over the world, blowing up and getting bigger and stronger, just like it is with you. From the moment you heard and got what God is doing, you've been hungry for more. And it's still going strong, just like when our friend and close associate Epaphras taught you. He's a super-reliable worker for Christ — I can always count on him. He's the one who told us how the Spirit has made love a huge part of your lives.</w:t>
             </w:r>
           </w:p>
         </w:tc>
@@ -400,7 +400,7 @@
               <w:rPr>
                 <w:sz w:val="18"/>
               </w:rPr>
-              <w:t>So for real, since we first heard about you, we haven't stopped praying for you. We're asking God to give you the smarts and the right vibe to totally get his plan. We're praying you'll live in a way that makes the Boss proud, working hard in his orchard. The more you learn how God operates, the better you'll get at your own stuff. We're praying you'll have the strength to hang in there when things get tough—not just gritting your teeth, but that awesome power-up God gives. It's the kind of strength that helps you handle anything and still be stoked, thanking the Father who made us worthy to be part of his awesome, bright future.</w:t>
+              <w:t>So for real, since we first heard about you, we haven't stopped praying for you. We're asking God to give you the smarts and the right vibe to totally get his plan. We're praying you'll live in a way that makes the Boss proud, working hard in his orchard. The more you learn how God operates, the better you'll get at your own stuff. We're praying you'll have the strength to hang in there when things get tough—not just gritting your teeth, but that awesome power-up God gives. It's the kind of strength that helps you handle anything and still be stoked, thanking the Father who makes us strong enough to take part in everything bright and beautiful he has for us.</w:t>
             </w:r>
           </w:p>
         </w:tc>
@@ -605,7 +605,7 @@
               <w:rPr>
                 <w:sz w:val="18"/>
               </w:rPr>
-              <w:t>When we look at this Son, we're basically seeing the invisible God. We see God's original blueprint for everything. Because everything, and I mean *everything*—in the sky, on the ground, stuff you can see and stuff you can't, even all the different levels of angels—it all started with him and is all about him. He was there before anything else existed, and he's the one holding it all together, even right now. And when it comes to the church, he's the one who organizes it and keeps it together, like a head on a body.</w:t>
+              <w:t>When we look at this Son, we're basically seeing the invisible God. We see God's original blueprint for everything. Because everything, and I mean *everything*—in the sky, on the ground, stuff you can see and stuff you can't, even rank after rank after rank of angels—it all started with him and is all about him. He was there before anything else existed, and he's the one holding it all together, even right now. And when it comes to the church, he's the one who organizes it and keeps it together, like a head on a body.</w:t>
             </w:r>
           </w:p>
         </w:tc>
@@ -747,7 +747,7 @@
               <w:rPr>
                 <w:sz w:val="18"/>
               </w:rPr>
-              <w:t>You guys are a perfect example of what he does. You used to have your backs to God, thinking rebellious stuff about him and causing trouble all the time. But now, because Christ went all in for you on the cross and literally died for you, he brought you back to God's side. He put your lives back together, making you whole and holy in his eyes. You don't just walk away from a gift like that! You stay grounded and solid in that trust, always tuned in to the message, and don't get sidetracked. There's no other message but this one. Every single person on earth gets this same message. And me, Paul? I'm one of the messengers.</w:t>
+              <w:t>You guys are a perfect example of what he does. You used to have your backs to God, thinking rebellious stuff about him and causing trouble all the time. But now, because Christ went all in for you on the cross and literally died for you, he brought you back to God's side. He put your lives back together, making you whole and holy in his eyes. You don't just walk away from a gift like that! You stay grounded and solid in that trust, always tuned in to the message, and don't get sidetracked. There's no other message but this one. Every single person on earth gets this same message. And me, Paul? I'm a messenger of this Message.</w:t>
             </w:r>
           </w:p>
         </w:tc>
@@ -889,7 +889,7 @@
               <w:rPr>
                 <w:sz w:val="18"/>
               </w:rPr>
-              <w:t>This big secret has been under wraps for a long time, but now it's out in the open. God wanted everyone, not just the Jews, to know this amazing and glorious secret, no matter who they are or what their background is. The secret is basically this: Christ is in you, so you can be sure you'll share in God's glory. It's that simple. That's what our message is all about. We preach Christ, and we warn people not to add a bunch of extra stuff to it. We teach with a lot of common sense so we can help everyone grow up and be mature. And being mature is just about one thing: Christ. Nothing more, nothing less. That's what I'm working my butt off for, day after day, year after year, using the awesome energy God gives me.</w:t>
+              <w:t>This big secret has been under wraps for a long time, but now it's out in the open. God wanted everyone, not just the Jews, to know this amazing and glorious secret inside and out, no matter their background or religious standing. The secret is basically this: Christ is in you, so you can be sure you'll share in God's glory. It's that simple. That's what our message is all about. We preach Christ, and we warn people not to add a bunch of extra stuff to it. We teach with profound common sense so we can help everyone grow up and be mature. And being mature is about the basics: Christ. Nothing more, nothing less. That's what I'm working my butt off for, day after day, year after year, using the awesome energy God gives me.</w:t>
             </w:r>
           </w:p>
         </w:tc>
@@ -1098,7 +1098,7 @@
               <w:rPr>
                 <w:sz w:val="18"/>
               </w:rPr>
-              <w:t>I want you all woven together into a tapestry of love, in touch with everything there is to know of God. I want your minds confident and at rest, focused on Christ, God's great mystery. All the richest treasures of wisdom and knowledge are packed into that mystery and nowhere else. And we've been shown the mystery! I'm telling you this so you don't get faked out by people trying to sell you some other “secret” or “mystery.”</w:t>
+              <w:t>I want you all woven together into a tapestry of love, in touch with everything there is to know of God. I want your minds confident and at rest, focused on Christ, God's great mystery. All the richest treasures of wisdom and knowledge are packed into that mystery and nowhere else. And we've been shown the mystery! I'm telling you this so you don't get led off on some wild-goose chase by people selling you another “secret” or “mystery.”</w:t>
             </w:r>
           </w:p>
         </w:tc>
@@ -1121,7 +1121,7 @@
               <w:rPr>
                 <w:sz w:val="18"/>
               </w:rPr>
-              <w:t>내가 바라는 건, 너네가 사랑으로 촘촘히 하나로 엮여서, 하나님을 알아가는 모든 경지에 이르는 거야. 그러면 너네 마음이 확신과 평안을 얻고, 하나님의 위대한 비밀인 그리스도한테 딱 꽂히게 될 거임. 모든 지혜와 지식의 가장 값진 보물이 그 비밀 안에 다 들어 있거든. 다른 데서는 절대 못 찾음. 이제 그 비밀이 우리한테 환하게 공개됐음! 내가 이 말을 왜 하냐면, 누가 너네를 꼬드겨서 이상한 길로 끌고 다니며 다른 비밀 같은 거나 '비밀' 같은 걸 쫓게 하고 싶지 않아서야.</w:t>
+              <w:t>내가 바라는 건, 너네가 사랑이라는 태피스트리로 촘촘히 하나로 엮여서, 하나님을 알아가는 모든 경지에 이르는 거야. 그러면 너네 마음이 확신과 평안을 얻고, 하나님의 위대한 비밀인 그리스도한테 딱 꽂히게 될 거임. 모든 지혜와 지식의 가장 값진 보물이 그 비밀 안에 다 들어 있거든. 다른 데서는 절대 못 찾음. 이제 그 비밀이 우리한테 환하게 공개됐음! 내가 이 말을 왜 하냐면, 누가 너네를 꼬드겨서 이상한 길로 끌고 다니며 다른 비밀 같은 거나 '비밀' 같은 걸 쫓게 하고 싶지 않아서야.</w:t>
             </w:r>
           </w:p>
         </w:tc>
@@ -1169,7 +1169,7 @@
               <w:rPr>
                 <w:sz w:val="18"/>
               </w:rPr>
-              <w:t>Yeah, I'm far away, and you might never meet me in person, but believe me, I'm right there with you. I'm stoked to hear that you're living right and that your faith in Christ is rock solid.</w:t>
+              <w:t>Yeah, I'm far away, and you might never meet me in person, but believe me, I'm on your side, right there with you. I'm stoked to hear you're living carefully and in good order, and that your faith in Christ is rock solid.</w:t>
             </w:r>
           </w:p>
         </w:tc>
@@ -1303,7 +1303,7 @@
               <w:rPr>
                 <w:sz w:val="18"/>
               </w:rPr>
-              <w:t>So here's the deal: you've got Christ Jesus, the Master. Now live like it. You're rooted in him, built on him. You know the playbook, so get out there and play! School's out — quit studying the subject and start living it. And let your living spill over into thanks.</w:t>
+              <w:t>So here's the deal: just go ahead with what you've been given. You've got Christ Jesus, the Master — now live him. You're deeply rooted in him, well built on him. You know the playbook, so get out there and play! School's out — quit studying the subject and start living it. And let your living spill over into thanks.</w:t>
             </w:r>
           </w:p>
         </w:tc>
@@ -1445,7 +1445,7 @@
               <w:rPr>
                 <w:sz w:val="18"/>
               </w:rPr>
-              <w:t>And you don't get in on this by following a bunch of rules or getting circumcised. Nah, you're already in. You got in through what Christ did for you when he wrecked the power of sin. Your baptism was like a funeral for your old life and a resurrection to a new one. God raised you from the dead, just like he did with Christ. When you were dead in your sins, you couldn't do anything for God. But God made you alive with Christ! Think about it! All your sins are gone, the slate is clean. That old arrest warrant against you was canceled and nailed to the cross. He stripped the universe's spiritual bullies of their fake authority at the Cross and marched them naked and totally humiliated through the streets.</w:t>
+              <w:t>Getting into this fullness isn't something you figure out or achieve. And you don't get in on this by following a bunch of rules or getting circumcised. Nah, you're already in — insiders. Not through some secretive initiation rite, but through what Christ did for you when he wrecked the power of sin. If it's an initiation ritual you're after, you've already been through it — your baptism was like a funeral for your old life and a resurrection to a new one. God raised you from the dead, just like he did with Christ. When you were dead in your sins, you couldn't do anything for God. But God made you alive with Christ! Think about it! All your sins are gone, the slate is clean. That old arrest warrant against you was canceled and nailed to Christ's cross. He stripped the universe's spiritual bullies of their fake authority at the Cross and marched them naked and totally humiliated through the streets.</w:t>
             </w:r>
           </w:p>
         </w:tc>
@@ -1516,7 +1516,7 @@
               <w:rPr>
                 <w:sz w:val="18"/>
               </w:rPr>
-              <w:t>So don't let anyone give you a hard time about what you eat or drink, or about religious festivals or holidays. That stuff is just a shadow of the real thing, and the real thing is Christ.</w:t>
+              <w:t>So don't let anyone give you a hard time about what you eat or drink, or about religious festivals or holidays. That stuff is just a shadow of what was to come — the real thing is Christ.</w:t>
             </w:r>
           </w:p>
         </w:tc>
@@ -1587,7 +1587,7 @@
               <w:rPr>
                 <w:sz w:val="18"/>
               </w:rPr>
-              <w:t>Don't put up with people who try to control you, telling you to bow down to angels and have visions. They're just full of hot air. They're not connected to the source of life, who is Christ. He's the one who holds us all together in one piece — his very breath and blood flow through us. He's the head, and we're the body. We can only grow up healthy in God if we're getting our life from him.</w:t>
+              <w:t>Don't put up with people who try to control you, ordering you to bow and scrape, pushing their angel obsession on you and insisting you chase visions. They're just full of hot air — that's all they are. They're not connected to the source of life, who is Christ. He's the one who holds us all together in one piece — his very breath and blood flow through us. He's the head, and we're the body. We can only grow up healthy in God if we're getting our life from him.</w:t>
             </w:r>
           </w:p>
         </w:tc>
@@ -1658,7 +1658,7 @@
               <w:rPr>
                 <w:sz w:val="18"/>
               </w:rPr>
-              <w:t>So if you've left all that fake, childish religion behind with Christ, why do you let people push you around with rules like, “Don't touch this! Don't taste that! Don't go near this!”? Do you really think that stuff that's here today and gone tomorrow is that important? It might sound impressive in a deep voice — all pious and humble and hardcore — but it's just another way of showing off and making yourself look good.</w:t>
+              <w:t>So if you've left all that puffed-up, childish religion behind with Christ, why do you let people push you around with rules like, “Don't touch this! Don't taste that! Don't go near this!”? Do you really think that stuff that's here today and gone tomorrow is that important? It might sound impressive in a deep voice — giving the illusion of being all pious and humble and hardcore — but it's just another way of showing off and making yourself look good.</w:t>
             </w:r>
           </w:p>
         </w:tc>
@@ -2001,7 +2001,7 @@
               <w:rPr>
                 <w:sz w:val="18"/>
               </w:rPr>
-              <w:t>So, you gotta drop everything connected to that old, dead life. All that horrible stuff: being unfaithful, being impure, always wanting more, doing whatever you want whenever you want, and just grabbing whatever looks good. That's a life run by things and feelings, not by God. And that's the kind of stuff that makes God want to just blow up in anger. You used to be all about that stuff, but you didn't know any better. Now you do, so get rid of it for good: getting mad all the time, being cranky, being mean, cussing, and talking trash.</w:t>
+              <w:t>So, you gotta drop everything connected to that old, dead life. All that horrible stuff: sleeping around, being impure, always wanting more, doing whatever you want whenever you want, and just grabbing whatever looks good. That's a life run by things and feelings, not by God. And that's the kind of stuff that makes God want to just blow up in anger. You used to be all about that stuff, but you didn't know any better. Now you do, so get rid of it for good: getting mad all the time, being cranky, being mean, cussing, and talking trash.</w:t>
             </w:r>
           </w:p>
         </w:tc>
@@ -2024,7 +2024,7 @@
               <w:rPr>
                 <w:sz w:val="18"/>
               </w:rPr>
-              <w:t>이건 죽음의 길과 관련된 모든 걸 끊어버리라는 뜻이야. 불륜, 더러운 짓, 욕정, 하고 싶은 대로 다 하려는 마음, 맘에 드는 건 다 가지려는 마음 같은 거 말이야. 그런 삶은 하나님이 아니라 물질과 감정이 만들어낸 삶이야. 하나님은 이런 것 때문에 완전 폭발하실 거야. 얼마 전까지만 해도 너네는 더 나은 걸 몰라서 그런 짓들을 하고 다녔지. 근데 이제 아니까, 그 모든 걸 영원히, 확실하게 버려. 분노, 욱하는 성격, 심술, 막말, 무례한 말 같은 거 다 버리라고.</w:t>
+              <w:t>이건 죽음의 길과 관련된 모든 걸 끊어버리라는 뜻이야. 문란한 성생활, 더러운 짓, 욕정, 하고 싶은 대로 다 하려는 마음, 맘에 드는 건 다 가지려는 마음 같은 거 말이야. 그런 삶은 하나님이 아니라 물질과 감정이 만들어낸 삶이야. 하나님은 이런 것 때문에 완전 폭발하실 거야. 얼마 전까지만 해도 너네는 더 나은 걸 몰라서 그런 짓들을 하고 다녔지. 근데 이제 아니까, 그 모든 걸 영원히, 확실하게 버려. 분노, 욱하는 성격, 심술, 막말, 무례한 말 같은 거 다 버리라고.</w:t>
             </w:r>
           </w:p>
         </w:tc>
@@ -2072,7 +2072,7 @@
               <w:rPr>
                 <w:sz w:val="18"/>
               </w:rPr>
-              <w:t>And don't lie to each other. You're done with that. It's like taking off a set of filthy, old clothes that don't even fit and throwing them in a fire. Now you've got a whole new wardrobe, a total transformation. Every piece is custom-made by God, with his name on it. All the old trends are out. Words like 'Jew' or 'non-Jew,' 'religious' or 'not religious,' 'insider' or 'outsider,' 'savage' or 'lame,' 'slave' or 'free'—they don't mean anything anymore. Now, everyone's all about Christ. Everyone's in the crew.</w:t>
+              <w:t>And don't lie to each other. You're done with that. It's like taking off a set of filthy, old clothes that don't even fit and throwing them in a fire. Now you've got a whole new wardrobe. Every piece is custom-made by God, with his name on it. All the old trends are out. Words like 'Jew' or 'non-Jew,' 'religious' or 'not religious,' 'insider' or 'outsider,' 'savage' or 'uncouth,' 'slave' or 'free'—they don't mean anything anymore. Now everyone's defined by Christ. Everyone's in Christ.</w:t>
             </w:r>
           </w:p>
         </w:tc>
@@ -2214,7 +2214,7 @@
               <w:rPr>
                 <w:sz w:val="18"/>
               </w:rPr>
-              <w:t>Let the peace of Christ keep you all on the same page, working together. No more going off and doing your own thing. And be thankful. Let the Word of Christ, the Message, just take over your whole house. Give it tons of space in your lives. Teach and help each other out with good advice. And sing! Sing your hearts out to God! Everything you do, every single detail—what you say, what you do, whatever—do it all for the Boss, for Jesus. And thank God the Father every step of the way.</w:t>
+              <w:t>Let the peace of Christ keep you all on the same page, working together. No more going off and doing your own thing. And be thankful. Let the Word of Christ, the Message, just take over your whole house. Give it tons of space in your lives. Teach and direct each other using good common sense. And sing! Sing your hearts out to God! Everything you do, every single detail—what you say, what you do, whatever—do it all for the Boss, for Jesus. And thank God the Father every step of the way.</w:t>
             </w:r>
           </w:p>
         </w:tc>
@@ -2308,7 +2308,7 @@
               <w:rPr>
                 <w:sz w:val="18"/>
               </w:rPr>
-              <w:t>아내들아, 남편을 이해하고 지지해줘. 주님을 기쁘게 하는 방식으로 남편한테 순종해.</w:t>
+              <w:t>아내들아, 남편을 이해하고 지지해줘. 주님께 영광이 되는 방식으로 남편한테 순종해.</w:t>
             </w:r>
           </w:p>
         </w:tc>
@@ -2569,7 +2569,7 @@
               <w:rPr>
                 <w:sz w:val="18"/>
               </w:rPr>
-              <w:t>And for all you workers out there, do what your earthly bosses tell you. Don't just do the bare minimum to get by. Do your best. Work from the heart for your real Boss, for God. You can be sure you'll get paid in full when you get your inheritance. Always remember, the ultimate Boss you're serving is Christ. The lazy worker who does a bad job will be held responsible. Being a follower of Jesus isn't an excuse for bad work.</w:t>
+              <w:t>And for all you workers out there, do what your earthly bosses tell you. Don't just do the bare minimum to get by. Do your best. Work from the heart for your real Boss, for God. You can be sure you'll get paid in full when you get your inheritance. Always remember, the ultimate Boss you're serving is Christ. The sullen worker who does shoddy work will be held responsible. Being a follower of Jesus isn't an excuse for bad work.</w:t>
             </w:r>
           </w:p>
         </w:tc>
@@ -2592,7 +2592,7 @@
               <w:rPr>
                 <w:sz w:val="18"/>
               </w:rPr>
-              <w:t>종으로 일하는 사람들은, 이 세상 주인이 시키는 대로 잘 따라. 대충 하지 말고, 최선을 다해. 마음을 다해서 일해. 너네 진짜 주인이신 하나님께 하듯 말이야. 유산을 상속받을 때 충분히 보상받을 거라고 믿어. 너네가 궁극적으로 섬기는 주인은 예수님이라는 걸 항상 기억해. 대충 일하는 불성실한 종은 그 책임을 지게 될 거야. 예수님 따른다고 해서 일 못해도 봐주는 거 없어.</w:t>
+              <w:t>종으로 일하는 사람들은, 이 세상 주인이 시키는 대로 잘 따라. 대충 하지 말고, 최선을 다해. 마음을 다해서 일해. 너네 진짜 주인이신 하나님께 하듯 말이야. 유산을 상속받을 때 충분히 보상받을 거라고 믿어. 너네가 궁극적으로 섬기는 주인은 예수님이라는 걸 항상 기억해. 심술궂게 대충 일하는 종은 그 책임을 지게 될 거야. 예수님 따른다고 해서 일 못해도 봐주는 거 없어.</w:t>
             </w:r>
           </w:p>
         </w:tc>
@@ -2912,7 +2912,7 @@
               <w:rPr>
                 <w:sz w:val="18"/>
               </w:rPr>
-              <w:t>Be smart about how you live and work around people who don't know Jesus — don't miss a trick. Make every moment count. When you talk, be cool and build people up; don't roast them or cut them out.</w:t>
+              <w:t>Be smart about how you live and work around people who don't know Jesus — don't miss a trick. Make every moment count. When you talk, be gracious and build people up; don't roast them or cut them out.</w:t>
             </w:r>
           </w:p>
         </w:tc>
@@ -2983,7 +2983,7 @@
               <w:rPr>
                 <w:sz w:val="18"/>
               </w:rPr>
-              <w:t>My boy Tychicus is coming to you, and he'll give you the full scoop on me. He's a solid guy and a great helper in God's work. I'm sending him so you know what's up with us and so he can get you hyped about your faith. I'm also sending Onesimus with him. He's one of your own, and he's become a super trustworthy and awesome bro. They'll tell you everything that's been going down here.</w:t>
+              <w:t>My boy Tychicus is coming to you, and he'll give you the full scoop on me. He's a trusted minister and a great companion in the Master's work. I'm sending him so you know what's up with us and so he can get you hyped about your faith. I'm also sending Onesimus with him. He's one of your own, and he's become a super trustworthy and dear bro. They'll tell you everything that's been going down here.</w:t>
             </w:r>
           </w:p>
         </w:tc>
@@ -3006,7 +3006,7 @@
               <w:rPr>
                 <w:sz w:val="18"/>
               </w:rPr>
-              <w:t>내 착한 친구 두기고가 내 소식을 다 알려줄 거야. 그는 주님을 섬기는 일에 완전 믿음직한 동료거든. 내가 걔를 보낸 건 너네한테 우리 사정을 알리고 너네 믿음을 응원해주려는 거임. 오네시모도 걔랑 함께 보냈어. 걔는 너네 고향 사람이고 완전 믿음직한 형제가 됐음! 걔네가 여기서 있었던 일 전부 다 말해줄 거야.</w:t>
+              <w:t>내 착한 친구 두기고가 내 소식을 다 알려줄 거야. 그는 주님을 섬기는 일에 완전 믿음직한 동료거든. 내가 걔를 보낸 건 너네한테 우리 사정을 알리고 너네 믿음을 응원해주려는 거임. 오네시모도 걔랑 함께 보냈어. 걔는 너네 고향 사람이고 완전 믿음직하고 소중한 형제가 됐음! 걔네가 여기서 있었던 일 전부 다 말해줄 거야.</w:t>
             </w:r>
           </w:p>
         </w:tc>
@@ -3054,7 +3054,7 @@
               <w:rPr>
                 <w:sz w:val="18"/>
               </w:rPr>
-              <w:t>Aristarchus, my cellmate, says 'sup. So does Mark, Barnabas's cousin. You got a letter about him, so if he rolls through, give him a warm welcome. Jesus, the one they call Justus, also sends a shout-out. These are the only guys from the old crew who are still with me, working for God's kingdom. They've been a huge help, for real.</w:t>
+              <w:t>Aristarchus, my cellmate, says 'sup. So does Mark, Barnabas's cousin. You got a letter about him, so if he rolls through, give him a warm welcome. Jesus, the one they call Justus, also sends a shout-out. These are the only guys from the old crew who are still with me, working for God's kingdom. Don't think they haven't been a big help — they really have!</w:t>
             </w:r>
           </w:p>
         </w:tc>
@@ -3125,7 +3125,7 @@
               <w:rPr>
                 <w:sz w:val="18"/>
               </w:rPr>
-              <w:t>Epaphras, who's from your town, says hi. That guy is a beast! He's always praying hard for you guys, that you'll stand firm, all grown up and confident in what God wants for you. I've seen him grind for you and the people in Laodicea and Hierapolis.</w:t>
+              <w:t>Epaphras, who's from your town, says hi. That guy is a beast! He's always praying hard for you guys, that you'll stand firm, all grown up and confident in everything God wants you to do. I've watched him closely, and I can tell you he's worked hard for you and the people in Laodicea and Hierapolis.</w:t>
             </w:r>
           </w:p>
         </w:tc>
@@ -3480,7 +3480,7 @@
               <w:rPr>
                 <w:sz w:val="18"/>
               </w:rPr>
-              <w:t>I'm signing this myself — Paul. Don't forget to pray for me while I'm in here. Grace out.</w:t>
+              <w:t>I'm signing off in my own handwriting — Paul. Don't forget to pray for me while I'm in here. Grace be with you.</w:t>
             </w:r>
           </w:p>
         </w:tc>
@@ -3503,7 +3503,7 @@
               <w:rPr>
                 <w:sz w:val="18"/>
               </w:rPr>
-              <w:t>나 바울이 직접 사인한다. 감옥에 갇힌 나를 위해 기도하는 거 잊지 마. 은혜가 너네랑 함께하길 바란다.</w:t>
+              <w:t>나 바울이 직접 친필로 사인한다. 감옥에 갇힌 나를 위해 기도하는 거 잊지 마. 은혜가 너네랑 함께하길 바란다.</w:t>
             </w:r>
           </w:p>
         </w:tc>

</xml_diff>